<commit_message>
expanded categories and POI checking
</commit_message>
<xml_diff>
--- a/outputs/tables/Table3_GPS_Reporting_Standards.docx
+++ b/outputs/tables/Table3_GPS_Reporting_Standards.docx
@@ -23,10 +23,9 @@
       </w:tblGrid>
       <w:tr>
         <w:trPr>
-          <w:trHeight w:val="580" w:hRule="auto"/>
+          <w:trHeight w:val="590" w:hRule="auto"/>
           <w:tblHeader/>
         </w:trPr>
-        header1
         <w:tc>
           <w:tcPr>
             <w:tcBorders>
@@ -46,6 +45,7 @@
           </w:tcPr>
           <w:p>
             <w:pPr>
+              <w:pStyle w:val="Normal"/>
               <w:jc w:val="left"/>
               <w:pBdr>
                 <w:bottom w:val="none" w:sz="0" w:space="0" w:color="000000"/>
@@ -60,6 +60,7 @@
                 <w:i w:val="false"/>
                 <w:b w:val="true"/>
                 <w:u w:val="none"/>
+                <w:strike w:val="false"/>
                 <w:sz w:val="18"/>
                 <w:szCs w:val="18"/>
                 <w:color w:val="000000"/>
@@ -71,6 +72,7 @@
                 <w:i w:val="false"/>
                 <w:b w:val="true"/>
                 <w:u w:val="none"/>
+                <w:strike w:val="false"/>
                 <w:sz w:val="18"/>
                 <w:szCs w:val="18"/>
                 <w:color w:val="000000"/>
@@ -98,6 +100,7 @@
           </w:tcPr>
           <w:p>
             <w:pPr>
+              <w:pStyle w:val="Normal"/>
               <w:jc w:val="center"/>
               <w:pBdr>
                 <w:bottom w:val="none" w:sz="0" w:space="0" w:color="000000"/>
@@ -112,6 +115,7 @@
                 <w:i w:val="false"/>
                 <w:b w:val="true"/>
                 <w:u w:val="none"/>
+                <w:strike w:val="false"/>
                 <w:sz w:val="18"/>
                 <w:szCs w:val="18"/>
                 <w:color w:val="000000"/>
@@ -123,6 +127,7 @@
                 <w:i w:val="false"/>
                 <w:b w:val="true"/>
                 <w:u w:val="none"/>
+                <w:strike w:val="false"/>
                 <w:sz w:val="18"/>
                 <w:szCs w:val="18"/>
                 <w:color w:val="000000"/>
@@ -150,6 +155,7 @@
           </w:tcPr>
           <w:p>
             <w:pPr>
+              <w:pStyle w:val="Normal"/>
               <w:jc w:val="center"/>
               <w:pBdr>
                 <w:bottom w:val="none" w:sz="0" w:space="0" w:color="000000"/>
@@ -164,6 +170,7 @@
                 <w:i w:val="false"/>
                 <w:b w:val="true"/>
                 <w:u w:val="none"/>
+                <w:strike w:val="false"/>
                 <w:sz w:val="18"/>
                 <w:szCs w:val="18"/>
                 <w:color w:val="000000"/>
@@ -175,6 +182,7 @@
                 <w:i w:val="false"/>
                 <w:b w:val="true"/>
                 <w:u w:val="none"/>
+                <w:strike w:val="false"/>
                 <w:sz w:val="18"/>
                 <w:szCs w:val="18"/>
                 <w:color w:val="000000"/>
@@ -186,9 +194,8 @@
       </w:tr>
       <w:tr>
         <w:trPr>
-          <w:trHeight w:val="580" w:hRule="auto"/>
+          <w:trHeight w:val="560" w:hRule="auto"/>
         </w:trPr>
-        body1
         <w:tc>
           <w:tcPr>
             <w:tcBorders>
@@ -208,6 +215,7 @@
           </w:tcPr>
           <w:p>
             <w:pPr>
+              <w:pStyle w:val="Normal"/>
               <w:jc w:val="left"/>
               <w:pBdr>
                 <w:bottom w:val="none" w:sz="0" w:space="0" w:color="000000"/>
@@ -222,6 +230,7 @@
                 <w:i w:val="false"/>
                 <w:b w:val="false"/>
                 <w:u w:val="none"/>
+                <w:strike w:val="false"/>
                 <w:sz w:val="18"/>
                 <w:szCs w:val="18"/>
                 <w:color w:val="000000"/>
@@ -233,6 +242,7 @@
                 <w:i w:val="false"/>
                 <w:b w:val="false"/>
                 <w:u w:val="none"/>
+                <w:strike w:val="false"/>
                 <w:sz w:val="18"/>
                 <w:szCs w:val="18"/>
                 <w:color w:val="000000"/>
@@ -260,6 +270,7 @@
           </w:tcPr>
           <w:p>
             <w:pPr>
+              <w:pStyle w:val="Normal"/>
               <w:jc w:val="center"/>
               <w:pBdr>
                 <w:bottom w:val="none" w:sz="0" w:space="0" w:color="000000"/>
@@ -274,6 +285,7 @@
                 <w:i w:val="false"/>
                 <w:b w:val="false"/>
                 <w:u w:val="none"/>
+                <w:strike w:val="false"/>
                 <w:sz w:val="18"/>
                 <w:szCs w:val="18"/>
                 <w:color w:val="000000"/>
@@ -285,6 +297,7 @@
                 <w:i w:val="false"/>
                 <w:b w:val="false"/>
                 <w:u w:val="none"/>
+                <w:strike w:val="false"/>
                 <w:sz w:val="18"/>
                 <w:szCs w:val="18"/>
                 <w:color w:val="000000"/>
@@ -312,6 +325,7 @@
           </w:tcPr>
           <w:p>
             <w:pPr>
+              <w:pStyle w:val="Normal"/>
               <w:jc w:val="center"/>
               <w:pBdr>
                 <w:bottom w:val="none" w:sz="0" w:space="0" w:color="000000"/>
@@ -326,6 +340,7 @@
                 <w:i w:val="false"/>
                 <w:b w:val="false"/>
                 <w:u w:val="none"/>
+                <w:strike w:val="false"/>
                 <w:sz w:val="18"/>
                 <w:szCs w:val="18"/>
                 <w:color w:val="000000"/>
@@ -337,6 +352,7 @@
                 <w:i w:val="false"/>
                 <w:b w:val="false"/>
                 <w:u w:val="none"/>
+                <w:strike w:val="false"/>
                 <w:sz w:val="18"/>
                 <w:szCs w:val="18"/>
                 <w:color w:val="000000"/>
@@ -348,9 +364,8 @@
       </w:tr>
       <w:tr>
         <w:trPr>
-          <w:trHeight w:val="580" w:hRule="auto"/>
+          <w:trHeight w:val="560" w:hRule="auto"/>
         </w:trPr>
-        body2
         <w:tc>
           <w:tcPr>
             <w:tcBorders>
@@ -370,6 +385,7 @@
           </w:tcPr>
           <w:p>
             <w:pPr>
+              <w:pStyle w:val="Normal"/>
               <w:jc w:val="left"/>
               <w:pBdr>
                 <w:bottom w:val="none" w:sz="0" w:space="0" w:color="000000"/>
@@ -384,6 +400,7 @@
                 <w:i w:val="false"/>
                 <w:b w:val="false"/>
                 <w:u w:val="none"/>
+                <w:strike w:val="false"/>
                 <w:sz w:val="18"/>
                 <w:szCs w:val="18"/>
                 <w:color w:val="000000"/>
@@ -395,6 +412,7 @@
                 <w:i w:val="false"/>
                 <w:b w:val="false"/>
                 <w:u w:val="none"/>
+                <w:strike w:val="false"/>
                 <w:sz w:val="18"/>
                 <w:szCs w:val="18"/>
                 <w:color w:val="000000"/>
@@ -422,6 +440,7 @@
           </w:tcPr>
           <w:p>
             <w:pPr>
+              <w:pStyle w:val="Normal"/>
               <w:jc w:val="center"/>
               <w:pBdr>
                 <w:bottom w:val="none" w:sz="0" w:space="0" w:color="000000"/>
@@ -436,6 +455,7 @@
                 <w:i w:val="false"/>
                 <w:b w:val="false"/>
                 <w:u w:val="none"/>
+                <w:strike w:val="false"/>
                 <w:sz w:val="18"/>
                 <w:szCs w:val="18"/>
                 <w:color w:val="000000"/>
@@ -447,6 +467,7 @@
                 <w:i w:val="false"/>
                 <w:b w:val="false"/>
                 <w:u w:val="none"/>
+                <w:strike w:val="false"/>
                 <w:sz w:val="18"/>
                 <w:szCs w:val="18"/>
                 <w:color w:val="000000"/>
@@ -474,6 +495,7 @@
           </w:tcPr>
           <w:p>
             <w:pPr>
+              <w:pStyle w:val="Normal"/>
               <w:jc w:val="center"/>
               <w:pBdr>
                 <w:bottom w:val="none" w:sz="0" w:space="0" w:color="000000"/>
@@ -488,6 +510,7 @@
                 <w:i w:val="false"/>
                 <w:b w:val="false"/>
                 <w:u w:val="none"/>
+                <w:strike w:val="false"/>
                 <w:sz w:val="18"/>
                 <w:szCs w:val="18"/>
                 <w:color w:val="000000"/>
@@ -499,6 +522,7 @@
                 <w:i w:val="false"/>
                 <w:b w:val="false"/>
                 <w:u w:val="none"/>
+                <w:strike w:val="false"/>
                 <w:sz w:val="18"/>
                 <w:szCs w:val="18"/>
                 <w:color w:val="000000"/>
@@ -510,9 +534,8 @@
       </w:tr>
       <w:tr>
         <w:trPr>
-          <w:trHeight w:val="580" w:hRule="auto"/>
+          <w:trHeight w:val="560" w:hRule="auto"/>
         </w:trPr>
-        body3
         <w:tc>
           <w:tcPr>
             <w:tcBorders>
@@ -532,6 +555,7 @@
           </w:tcPr>
           <w:p>
             <w:pPr>
+              <w:pStyle w:val="Normal"/>
               <w:jc w:val="left"/>
               <w:pBdr>
                 <w:bottom w:val="none" w:sz="0" w:space="0" w:color="000000"/>
@@ -546,6 +570,7 @@
                 <w:i w:val="false"/>
                 <w:b w:val="false"/>
                 <w:u w:val="none"/>
+                <w:strike w:val="false"/>
                 <w:sz w:val="18"/>
                 <w:szCs w:val="18"/>
                 <w:color w:val="000000"/>
@@ -557,6 +582,7 @@
                 <w:i w:val="false"/>
                 <w:b w:val="false"/>
                 <w:u w:val="none"/>
+                <w:strike w:val="false"/>
                 <w:sz w:val="18"/>
                 <w:szCs w:val="18"/>
                 <w:color w:val="000000"/>
@@ -584,6 +610,7 @@
           </w:tcPr>
           <w:p>
             <w:pPr>
+              <w:pStyle w:val="Normal"/>
               <w:jc w:val="center"/>
               <w:pBdr>
                 <w:bottom w:val="none" w:sz="0" w:space="0" w:color="000000"/>
@@ -598,6 +625,7 @@
                 <w:i w:val="false"/>
                 <w:b w:val="false"/>
                 <w:u w:val="none"/>
+                <w:strike w:val="false"/>
                 <w:sz w:val="18"/>
                 <w:szCs w:val="18"/>
                 <w:color w:val="000000"/>
@@ -609,6 +637,7 @@
                 <w:i w:val="false"/>
                 <w:b w:val="false"/>
                 <w:u w:val="none"/>
+                <w:strike w:val="false"/>
                 <w:sz w:val="18"/>
                 <w:szCs w:val="18"/>
                 <w:color w:val="000000"/>
@@ -636,6 +665,7 @@
           </w:tcPr>
           <w:p>
             <w:pPr>
+              <w:pStyle w:val="Normal"/>
               <w:jc w:val="center"/>
               <w:pBdr>
                 <w:bottom w:val="none" w:sz="0" w:space="0" w:color="000000"/>
@@ -650,6 +680,7 @@
                 <w:i w:val="false"/>
                 <w:b w:val="false"/>
                 <w:u w:val="none"/>
+                <w:strike w:val="false"/>
                 <w:sz w:val="18"/>
                 <w:szCs w:val="18"/>
                 <w:color w:val="000000"/>
@@ -661,6 +692,7 @@
                 <w:i w:val="false"/>
                 <w:b w:val="false"/>
                 <w:u w:val="none"/>
+                <w:strike w:val="false"/>
                 <w:sz w:val="18"/>
                 <w:szCs w:val="18"/>
                 <w:color w:val="000000"/>
@@ -672,9 +704,8 @@
       </w:tr>
       <w:tr>
         <w:trPr>
-          <w:trHeight w:val="580" w:hRule="auto"/>
+          <w:trHeight w:val="560" w:hRule="auto"/>
         </w:trPr>
-        body4
         <w:tc>
           <w:tcPr>
             <w:tcBorders>
@@ -694,6 +725,7 @@
           </w:tcPr>
           <w:p>
             <w:pPr>
+              <w:pStyle w:val="Normal"/>
               <w:jc w:val="left"/>
               <w:pBdr>
                 <w:bottom w:val="none" w:sz="0" w:space="0" w:color="000000"/>
@@ -708,6 +740,7 @@
                 <w:i w:val="false"/>
                 <w:b w:val="false"/>
                 <w:u w:val="none"/>
+                <w:strike w:val="false"/>
                 <w:sz w:val="18"/>
                 <w:szCs w:val="18"/>
                 <w:color w:val="000000"/>
@@ -719,6 +752,7 @@
                 <w:i w:val="false"/>
                 <w:b w:val="false"/>
                 <w:u w:val="none"/>
+                <w:strike w:val="false"/>
                 <w:sz w:val="18"/>
                 <w:szCs w:val="18"/>
                 <w:color w:val="000000"/>
@@ -746,6 +780,7 @@
           </w:tcPr>
           <w:p>
             <w:pPr>
+              <w:pStyle w:val="Normal"/>
               <w:jc w:val="center"/>
               <w:pBdr>
                 <w:bottom w:val="none" w:sz="0" w:space="0" w:color="000000"/>
@@ -760,6 +795,7 @@
                 <w:i w:val="false"/>
                 <w:b w:val="false"/>
                 <w:u w:val="none"/>
+                <w:strike w:val="false"/>
                 <w:sz w:val="18"/>
                 <w:szCs w:val="18"/>
                 <w:color w:val="000000"/>
@@ -771,6 +807,7 @@
                 <w:i w:val="false"/>
                 <w:b w:val="false"/>
                 <w:u w:val="none"/>
+                <w:strike w:val="false"/>
                 <w:sz w:val="18"/>
                 <w:szCs w:val="18"/>
                 <w:color w:val="000000"/>
@@ -798,6 +835,7 @@
           </w:tcPr>
           <w:p>
             <w:pPr>
+              <w:pStyle w:val="Normal"/>
               <w:jc w:val="center"/>
               <w:pBdr>
                 <w:bottom w:val="none" w:sz="0" w:space="0" w:color="000000"/>
@@ -812,6 +850,7 @@
                 <w:i w:val="false"/>
                 <w:b w:val="false"/>
                 <w:u w:val="none"/>
+                <w:strike w:val="false"/>
                 <w:sz w:val="18"/>
                 <w:szCs w:val="18"/>
                 <w:color w:val="000000"/>
@@ -823,6 +862,7 @@
                 <w:i w:val="false"/>
                 <w:b w:val="false"/>
                 <w:u w:val="none"/>
+                <w:strike w:val="false"/>
                 <w:sz w:val="18"/>
                 <w:szCs w:val="18"/>
                 <w:color w:val="000000"/>
@@ -834,9 +874,8 @@
       </w:tr>
       <w:tr>
         <w:trPr>
-          <w:trHeight w:val="580" w:hRule="auto"/>
+          <w:trHeight w:val="560" w:hRule="auto"/>
         </w:trPr>
-        body5
         <w:tc>
           <w:tcPr>
             <w:tcBorders>
@@ -856,6 +895,7 @@
           </w:tcPr>
           <w:p>
             <w:pPr>
+              <w:pStyle w:val="Normal"/>
               <w:jc w:val="left"/>
               <w:pBdr>
                 <w:bottom w:val="none" w:sz="0" w:space="0" w:color="000000"/>
@@ -870,6 +910,7 @@
                 <w:i w:val="false"/>
                 <w:b w:val="false"/>
                 <w:u w:val="none"/>
+                <w:strike w:val="false"/>
                 <w:sz w:val="18"/>
                 <w:szCs w:val="18"/>
                 <w:color w:val="000000"/>
@@ -881,6 +922,7 @@
                 <w:i w:val="false"/>
                 <w:b w:val="false"/>
                 <w:u w:val="none"/>
+                <w:strike w:val="false"/>
                 <w:sz w:val="18"/>
                 <w:szCs w:val="18"/>
                 <w:color w:val="000000"/>
@@ -908,6 +950,7 @@
           </w:tcPr>
           <w:p>
             <w:pPr>
+              <w:pStyle w:val="Normal"/>
               <w:jc w:val="center"/>
               <w:pBdr>
                 <w:bottom w:val="none" w:sz="0" w:space="0" w:color="000000"/>
@@ -922,6 +965,7 @@
                 <w:i w:val="false"/>
                 <w:b w:val="false"/>
                 <w:u w:val="none"/>
+                <w:strike w:val="false"/>
                 <w:sz w:val="18"/>
                 <w:szCs w:val="18"/>
                 <w:color w:val="000000"/>
@@ -933,6 +977,7 @@
                 <w:i w:val="false"/>
                 <w:b w:val="false"/>
                 <w:u w:val="none"/>
+                <w:strike w:val="false"/>
                 <w:sz w:val="18"/>
                 <w:szCs w:val="18"/>
                 <w:color w:val="000000"/>
@@ -960,6 +1005,7 @@
           </w:tcPr>
           <w:p>
             <w:pPr>
+              <w:pStyle w:val="Normal"/>
               <w:jc w:val="center"/>
               <w:pBdr>
                 <w:bottom w:val="none" w:sz="0" w:space="0" w:color="000000"/>
@@ -974,6 +1020,7 @@
                 <w:i w:val="false"/>
                 <w:b w:val="false"/>
                 <w:u w:val="none"/>
+                <w:strike w:val="false"/>
                 <w:sz w:val="18"/>
                 <w:szCs w:val="18"/>
                 <w:color w:val="000000"/>
@@ -985,6 +1032,7 @@
                 <w:i w:val="false"/>
                 <w:b w:val="false"/>
                 <w:u w:val="none"/>
+                <w:strike w:val="false"/>
                 <w:sz w:val="18"/>
                 <w:szCs w:val="18"/>
                 <w:color w:val="000000"/>
@@ -996,9 +1044,8 @@
       </w:tr>
       <w:tr>
         <w:trPr>
-          <w:trHeight w:val="580" w:hRule="auto"/>
+          <w:trHeight w:val="560" w:hRule="auto"/>
         </w:trPr>
-        body6
         <w:tc>
           <w:tcPr>
             <w:tcBorders>
@@ -1018,6 +1065,7 @@
           </w:tcPr>
           <w:p>
             <w:pPr>
+              <w:pStyle w:val="Normal"/>
               <w:jc w:val="left"/>
               <w:pBdr>
                 <w:bottom w:val="none" w:sz="0" w:space="0" w:color="000000"/>
@@ -1032,6 +1080,7 @@
                 <w:i w:val="false"/>
                 <w:b w:val="false"/>
                 <w:u w:val="none"/>
+                <w:strike w:val="false"/>
                 <w:sz w:val="18"/>
                 <w:szCs w:val="18"/>
                 <w:color w:val="000000"/>
@@ -1043,6 +1092,7 @@
                 <w:i w:val="false"/>
                 <w:b w:val="false"/>
                 <w:u w:val="none"/>
+                <w:strike w:val="false"/>
                 <w:sz w:val="18"/>
                 <w:szCs w:val="18"/>
                 <w:color w:val="000000"/>
@@ -1070,6 +1120,7 @@
           </w:tcPr>
           <w:p>
             <w:pPr>
+              <w:pStyle w:val="Normal"/>
               <w:jc w:val="center"/>
               <w:pBdr>
                 <w:bottom w:val="none" w:sz="0" w:space="0" w:color="000000"/>
@@ -1084,6 +1135,7 @@
                 <w:i w:val="false"/>
                 <w:b w:val="false"/>
                 <w:u w:val="none"/>
+                <w:strike w:val="false"/>
                 <w:sz w:val="18"/>
                 <w:szCs w:val="18"/>
                 <w:color w:val="000000"/>
@@ -1095,6 +1147,7 @@
                 <w:i w:val="false"/>
                 <w:b w:val="false"/>
                 <w:u w:val="none"/>
+                <w:strike w:val="false"/>
                 <w:sz w:val="18"/>
                 <w:szCs w:val="18"/>
                 <w:color w:val="000000"/>
@@ -1122,6 +1175,7 @@
           </w:tcPr>
           <w:p>
             <w:pPr>
+              <w:pStyle w:val="Normal"/>
               <w:jc w:val="center"/>
               <w:pBdr>
                 <w:bottom w:val="none" w:sz="0" w:space="0" w:color="000000"/>
@@ -1136,6 +1190,7 @@
                 <w:i w:val="false"/>
                 <w:b w:val="false"/>
                 <w:u w:val="none"/>
+                <w:strike w:val="false"/>
                 <w:sz w:val="18"/>
                 <w:szCs w:val="18"/>
                 <w:color w:val="000000"/>
@@ -1147,6 +1202,7 @@
                 <w:i w:val="false"/>
                 <w:b w:val="false"/>
                 <w:u w:val="none"/>
+                <w:strike w:val="false"/>
                 <w:sz w:val="18"/>
                 <w:szCs w:val="18"/>
                 <w:color w:val="000000"/>
@@ -1158,9 +1214,8 @@
       </w:tr>
       <w:tr>
         <w:trPr>
-          <w:trHeight w:val="580" w:hRule="auto"/>
+          <w:trHeight w:val="560" w:hRule="auto"/>
         </w:trPr>
-        body7
         <w:tc>
           <w:tcPr>
             <w:tcBorders>
@@ -1180,6 +1235,7 @@
           </w:tcPr>
           <w:p>
             <w:pPr>
+              <w:pStyle w:val="Normal"/>
               <w:jc w:val="left"/>
               <w:pBdr>
                 <w:bottom w:val="none" w:sz="0" w:space="0" w:color="000000"/>
@@ -1194,6 +1250,7 @@
                 <w:i w:val="false"/>
                 <w:b w:val="false"/>
                 <w:u w:val="none"/>
+                <w:strike w:val="false"/>
                 <w:sz w:val="18"/>
                 <w:szCs w:val="18"/>
                 <w:color w:val="000000"/>
@@ -1205,6 +1262,7 @@
                 <w:i w:val="false"/>
                 <w:b w:val="false"/>
                 <w:u w:val="none"/>
+                <w:strike w:val="false"/>
                 <w:sz w:val="18"/>
                 <w:szCs w:val="18"/>
                 <w:color w:val="000000"/>
@@ -1232,6 +1290,7 @@
           </w:tcPr>
           <w:p>
             <w:pPr>
+              <w:pStyle w:val="Normal"/>
               <w:jc w:val="center"/>
               <w:pBdr>
                 <w:bottom w:val="none" w:sz="0" w:space="0" w:color="000000"/>
@@ -1246,6 +1305,7 @@
                 <w:i w:val="false"/>
                 <w:b w:val="false"/>
                 <w:u w:val="none"/>
+                <w:strike w:val="false"/>
                 <w:sz w:val="18"/>
                 <w:szCs w:val="18"/>
                 <w:color w:val="000000"/>
@@ -1257,6 +1317,7 @@
                 <w:i w:val="false"/>
                 <w:b w:val="false"/>
                 <w:u w:val="none"/>
+                <w:strike w:val="false"/>
                 <w:sz w:val="18"/>
                 <w:szCs w:val="18"/>
                 <w:color w:val="000000"/>
@@ -1284,6 +1345,7 @@
           </w:tcPr>
           <w:p>
             <w:pPr>
+              <w:pStyle w:val="Normal"/>
               <w:jc w:val="center"/>
               <w:pBdr>
                 <w:bottom w:val="none" w:sz="0" w:space="0" w:color="000000"/>
@@ -1298,6 +1360,7 @@
                 <w:i w:val="false"/>
                 <w:b w:val="false"/>
                 <w:u w:val="none"/>
+                <w:strike w:val="false"/>
                 <w:sz w:val="18"/>
                 <w:szCs w:val="18"/>
                 <w:color w:val="000000"/>
@@ -1309,6 +1372,7 @@
                 <w:i w:val="false"/>
                 <w:b w:val="false"/>
                 <w:u w:val="none"/>
+                <w:strike w:val="false"/>
                 <w:sz w:val="18"/>
                 <w:szCs w:val="18"/>
                 <w:color w:val="000000"/>
@@ -1320,9 +1384,8 @@
       </w:tr>
       <w:tr>
         <w:trPr>
-          <w:trHeight w:val="580" w:hRule="auto"/>
+          <w:trHeight w:val="575" w:hRule="auto"/>
         </w:trPr>
-        body8
         <w:tc>
           <w:tcPr>
             <w:tcBorders>
@@ -1342,6 +1405,7 @@
           </w:tcPr>
           <w:p>
             <w:pPr>
+              <w:pStyle w:val="Normal"/>
               <w:jc w:val="left"/>
               <w:pBdr>
                 <w:bottom w:val="none" w:sz="0" w:space="0" w:color="000000"/>
@@ -1356,6 +1420,7 @@
                 <w:i w:val="false"/>
                 <w:b w:val="false"/>
                 <w:u w:val="none"/>
+                <w:strike w:val="false"/>
                 <w:sz w:val="18"/>
                 <w:szCs w:val="18"/>
                 <w:color w:val="000000"/>
@@ -1367,6 +1432,7 @@
                 <w:i w:val="false"/>
                 <w:b w:val="false"/>
                 <w:u w:val="none"/>
+                <w:strike w:val="false"/>
                 <w:sz w:val="18"/>
                 <w:szCs w:val="18"/>
                 <w:color w:val="000000"/>
@@ -1394,6 +1460,7 @@
           </w:tcPr>
           <w:p>
             <w:pPr>
+              <w:pStyle w:val="Normal"/>
               <w:jc w:val="center"/>
               <w:pBdr>
                 <w:bottom w:val="none" w:sz="0" w:space="0" w:color="000000"/>
@@ -1408,6 +1475,7 @@
                 <w:i w:val="false"/>
                 <w:b w:val="false"/>
                 <w:u w:val="none"/>
+                <w:strike w:val="false"/>
                 <w:sz w:val="18"/>
                 <w:szCs w:val="18"/>
                 <w:color w:val="000000"/>
@@ -1419,6 +1487,7 @@
                 <w:i w:val="false"/>
                 <w:b w:val="false"/>
                 <w:u w:val="none"/>
+                <w:strike w:val="false"/>
                 <w:sz w:val="18"/>
                 <w:szCs w:val="18"/>
                 <w:color w:val="000000"/>
@@ -1446,6 +1515,7 @@
           </w:tcPr>
           <w:p>
             <w:pPr>
+              <w:pStyle w:val="Normal"/>
               <w:jc w:val="center"/>
               <w:pBdr>
                 <w:bottom w:val="none" w:sz="0" w:space="0" w:color="000000"/>
@@ -1460,6 +1530,7 @@
                 <w:i w:val="false"/>
                 <w:b w:val="false"/>
                 <w:u w:val="none"/>
+                <w:strike w:val="false"/>
                 <w:sz w:val="18"/>
                 <w:szCs w:val="18"/>
                 <w:color w:val="000000"/>
@@ -1471,6 +1542,7 @@
                 <w:i w:val="false"/>
                 <w:b w:val="false"/>
                 <w:u w:val="none"/>
+                <w:strike w:val="false"/>
                 <w:sz w:val="18"/>
                 <w:szCs w:val="18"/>
                 <w:color w:val="000000"/>

</xml_diff>